<commit_message>
Rebuild HRM SOPs — remove italic Why: label (template fix retrofit)
Reruns build_hrm_sops_v2.py against the already-fixed
sop_record_common.py so HRM's SOP body text drops the "Why:" label
in the same way PSQ/HIC/IMS already do. No content or source
changes — mechanical re-render only.

Co-Authored-By: Claude Sonnet 5 <noreply@anthropic.com>
Claude-Session: https://claude.ai/code/session_016VFLsECWt4VArpBiaqgrgF
</commit_message>
<xml_diff>
--- a/policies/build/sop_record_masters/HRM/SOP_HRM.1.b_recruitment.docx
+++ b/policies/build/sop_record_masters/HRM/SOP_HRM.1.b_recruitment.docx
@@ -208,12 +208,6 @@
     </w:p>
     <w:p>
       <w:r>
-        <w:rPr>
-          <w:i/>
-        </w:rPr>
-        <w:t xml:space="preserve">Why: </w:t>
-      </w:r>
-      <w:r>
         <w:t>so every category of staff being recruited -- including doctors and nurses whose registration must be checked -- goes through the same gate.</w:t>
       </w:r>
     </w:p>
@@ -231,12 +225,6 @@
       </w:r>
     </w:p>
     <w:p>
-      <w:r>
-        <w:rPr>
-          <w:i/>
-        </w:rPr>
-        <w:t xml:space="preserve">Why: </w:t>
-      </w:r>
       <w:r>
         <w:t>a vacancy filled without a documented reason, or a registration nobody actually checked, is a gap that only surfaces after someone is already working.</w:t>
       </w:r>
@@ -303,12 +291,6 @@
     </w:p>
     <w:p>
       <w:r>
-        <w:rPr>
-          <w:i/>
-        </w:rPr>
-        <w:t xml:space="preserve">Why: </w:t>
-      </w:r>
-      <w:r>
         <w:t>A vacancy filled without a documented reason is the first point where recruitment stops being transparent.</w:t>
       </w:r>
     </w:p>
@@ -336,12 +318,6 @@
       </w:r>
     </w:p>
     <w:p>
-      <w:r>
-        <w:rPr>
-          <w:i/>
-        </w:rPr>
-        <w:t xml:space="preserve">Why: </w:t>
-      </w:r>
       <w:r>
         <w:t>Deciding who gets shortlisted or selected without a stated reason is exactly how an unqualified or unverified candidate can be chosen informally.</w:t>
       </w:r>
@@ -371,12 +347,6 @@
     </w:p>
     <w:p>
       <w:r>
-        <w:rPr>
-          <w:i/>
-        </w:rPr>
-        <w:t xml:space="preserve">Why: </w:t>
-      </w:r>
-      <w:r>
         <w:t>A doctor whose registration has lapsed, or a nurse who was never enrolled on a State nursing register, is not legally entitled to practise -- an interview score alone says nothing about this, and finding out after appointment is too late.</w:t>
       </w:r>
     </w:p>
@@ -405,12 +375,6 @@
     </w:p>
     <w:p>
       <w:r>
-        <w:rPr>
-          <w:i/>
-        </w:rPr>
-        <w:t xml:space="preserve">Why: </w:t>
-      </w:r>
-      <w:r>
         <w:t>A register that is updated only when someone asks for it is not evidence of a transparent process -- closing the loop in writing, at the time it happens, is what makes the record trustworthy.</w:t>
       </w:r>
     </w:p>
@@ -438,12 +402,6 @@
       </w:r>
     </w:p>
     <w:p>
-      <w:r>
-        <w:rPr>
-          <w:i/>
-        </w:rPr>
-        <w:t xml:space="preserve">Why: </w:t>
-      </w:r>
       <w:r>
         <w:t>A vacancy that genuinely cannot wait for the full process -- a sudden resignation leaving a shift uncovered -- cannot be allowed to bypass recruitment altogether; it has to be filled on a documented interim basis and then regularised, not left as an undocumented exception.</w:t>
       </w:r>

</xml_diff>